<commit_message>
Update supplementary material and add a typeset PDF
- Correct table cross-references (numbering shifted when the differentiation table was added)
- New S3 "Figure and table index" mapping every figure/table to the script that produces it
- Renumber the following sections accordingly (S4 raw data, S5 derivations, S6 evidence, S7 limits)
- Replace bare Unicode Greek/operators with LaTeX math so the document typesets cleanly
- Build supplementary.pdf via pandoc + XeLaTeX (5 pages, TOC, hyperlinks); refresh the .docx

Co-Authored-By: Claude Opus 4.8 <noreply@anthropic.com>
</commit_message>
<xml_diff>
--- a/paper/supplementary.docx
+++ b/paper/supplementary.docx
@@ -2,7 +2,7 @@
 <file path=word/document.xml><?xml version="1.0" encoding="utf-8"?>
 <w:document xmlns:w="http://schemas.openxmlformats.org/wordprocessingml/2006/main" xmlns:m="http://schemas.openxmlformats.org/officeDocument/2006/math" xmlns:r="http://schemas.openxmlformats.org/officeDocument/2006/relationships" xmlns:o="urn:schemas-microsoft-com:office:office" xmlns:v="urn:schemas-microsoft-com:vml" xmlns:w10="urn:schemas-microsoft-com:office:word" xmlns:a="http://schemas.openxmlformats.org/drawingml/2006/main" xmlns:pic="http://schemas.openxmlformats.org/drawingml/2006/picture" xmlns:wp="http://schemas.openxmlformats.org/drawingml/2006/wordprocessingDrawing">
   <w:body>
-    <w:bookmarkStart w:id="21" w:name="supplementary-material"/>
+    <w:bookmarkStart w:id="22" w:name="supplementary-material"/>
     <w:p>
       <w:pPr>
         <w:pStyle w:val="Heading1"/>
@@ -787,7 +787,21 @@
               <w:jc w:val="left"/>
             </w:pPr>
             <w:r>
-              <w:t xml:space="preserve">Correctness: ensemble ρ vs. Aer</w:t>
+              <w:t xml:space="preserve">Correctness: ensemble</w:t>
+            </w:r>
+            <w:r>
+              <w:t xml:space="preserve"> </w:t>
+            </w:r>
+            <m:oMath>
+              <m:r>
+                <m:t>ρ</m:t>
+              </m:r>
+            </m:oMath>
+            <w:r>
+              <w:t xml:space="preserve"> </w:t>
+            </w:r>
+            <w:r>
+              <w:t xml:space="preserve">vs. Aer</w:t>
             </w:r>
             <w:r>
               <w:t xml:space="preserve"> </w:t>
@@ -799,7 +813,38 @@
               <w:t xml:space="preserve">density_matrix</w:t>
             </w:r>
             <w:r>
-              <w:t xml:space="preserve">; 1/√N convergence (Fig. 2)</w:t>
+              <w:t xml:space="preserve">;</w:t>
+            </w:r>
+            <w:r>
+              <w:t xml:space="preserve"> </w:t>
+            </w:r>
+            <m:oMath>
+              <m:r>
+                <m:t>1</m:t>
+              </m:r>
+              <m:r>
+                <m:rPr>
+                  <m:sty m:val="p"/>
+                </m:rPr>
+                <m:t>/</m:t>
+              </m:r>
+              <m:rad>
+                <m:radPr>
+                  <m:degHide m:val="on"/>
+                </m:radPr>
+                <m:deg/>
+                <m:e>
+                  <m:r>
+                    <m:t>N</m:t>
+                  </m:r>
+                </m:e>
+              </m:rad>
+            </m:oMath>
+            <w:r>
+              <w:t xml:space="preserve"> </w:t>
+            </w:r>
+            <w:r>
+              <w:t xml:space="preserve">convergence (Fig. 2)</w:t>
             </w:r>
           </w:p>
         </w:tc>
@@ -1337,39 +1382,13 @@
     </w:p>
     <w:bookmarkEnd w:id="12"/>
     <w:bookmarkEnd w:id="13"/>
-    <w:bookmarkStart w:id="14" w:name="s3.-raw-data-dictionary"/>
+    <w:bookmarkStart w:id="14" w:name="s3.-figure-and-table-index"/>
     <w:p>
       <w:pPr>
         <w:pStyle w:val="Heading2"/>
       </w:pPr>
       <w:r>
-        <w:t xml:space="preserve">S3. Raw data dictionary</w:t>
-      </w:r>
-    </w:p>
-    <w:p>
-      <w:pPr>
-        <w:pStyle w:val="FirstParagraph"/>
-      </w:pPr>
-      <w:r>
-        <w:t xml:space="preserve">All raw outputs are archived as CSV under</w:t>
-      </w:r>
-      <w:r>
-        <w:t xml:space="preserve"> </w:t>
-      </w:r>
-      <w:r>
-        <w:rPr>
-          <w:rStyle w:val="VerbatimChar"/>
-        </w:rPr>
-        <w:t xml:space="preserve">bench/results/</w:t>
-      </w:r>
-      <w:r>
-        <w:t xml:space="preserve">, each with a comment header recording the</w:t>
-      </w:r>
-      <w:r>
-        <w:t xml:space="preserve"> </w:t>
-      </w:r>
-      <w:r>
-        <w:t xml:space="preserve">environment, circuit, noise strength, and seed.</w:t>
+        <w:t xml:space="preserve">S3. Figure and table index</w:t>
       </w:r>
     </w:p>
     <w:tbl>
@@ -1396,6 +1415,593 @@
               <w:jc w:val="left"/>
             </w:pPr>
             <w:r>
+              <w:t xml:space="preserve">Item</w:t>
+            </w:r>
+          </w:p>
+        </w:tc>
+        <w:tc>
+          <w:tcPr/>
+          <w:p>
+            <w:pPr>
+              <w:pStyle w:val="Compact"/>
+              <w:jc w:val="left"/>
+            </w:pPr>
+            <w:r>
+              <w:t xml:space="preserve">Content</w:t>
+            </w:r>
+          </w:p>
+        </w:tc>
+        <w:tc>
+          <w:tcPr/>
+          <w:p>
+            <w:pPr>
+              <w:pStyle w:val="Compact"/>
+              <w:jc w:val="left"/>
+            </w:pPr>
+            <w:r>
+              <w:t xml:space="preserve">Produced by</w:t>
+            </w:r>
+          </w:p>
+        </w:tc>
+      </w:tr>
+      <w:tr>
+        <w:tc>
+          <w:tcPr/>
+          <w:p>
+            <w:pPr>
+              <w:pStyle w:val="Compact"/>
+              <w:jc w:val="left"/>
+            </w:pPr>
+            <w:r>
+              <w:t xml:space="preserve">Fig. 1</w:t>
+            </w:r>
+          </w:p>
+        </w:tc>
+        <w:tc>
+          <w:tcPr/>
+          <w:p>
+            <w:pPr>
+              <w:pStyle w:val="Compact"/>
+              <w:jc w:val="left"/>
+            </w:pPr>
+            <w:r>
+              <w:t xml:space="preserve">Concept: where this work intervenes in the Qiskit-Aer stack</w:t>
+            </w:r>
+          </w:p>
+        </w:tc>
+        <w:tc>
+          <w:tcPr/>
+          <w:p>
+            <w:pPr>
+              <w:pStyle w:val="Compact"/>
+              <w:jc w:val="left"/>
+            </w:pPr>
+            <w:r>
+              <w:rPr>
+                <w:rStyle w:val="VerbatimChar"/>
+              </w:rPr>
+              <w:t xml:space="preserve">paper/figures/make_figures.py</w:t>
+            </w:r>
+            <w:r>
+              <w:t xml:space="preserve"> </w:t>
+            </w:r>
+            <w:r>
+              <w:t xml:space="preserve">(schematic)</w:t>
+            </w:r>
+          </w:p>
+        </w:tc>
+      </w:tr>
+      <w:tr>
+        <w:tc>
+          <w:tcPr/>
+          <w:p>
+            <w:pPr>
+              <w:pStyle w:val="Compact"/>
+              <w:jc w:val="left"/>
+            </w:pPr>
+            <w:r>
+              <w:t xml:space="preserve">Fig. 2</w:t>
+            </w:r>
+          </w:p>
+        </w:tc>
+        <w:tc>
+          <w:tcPr/>
+          <w:p>
+            <w:pPr>
+              <w:pStyle w:val="Compact"/>
+              <w:jc w:val="left"/>
+            </w:pPr>
+            <w:r>
+              <w:t xml:space="preserve">Correctness: trace distance vs. </w:t>
+            </w:r>
+            <m:oMath>
+              <m:r>
+                <m:t>N</m:t>
+              </m:r>
+            </m:oMath>
+            <w:r>
+              <w:t xml:space="preserve">,</w:t>
+            </w:r>
+            <w:r>
+              <w:t xml:space="preserve"> </w:t>
+            </w:r>
+            <m:oMath>
+              <m:r>
+                <m:t>1</m:t>
+              </m:r>
+              <m:r>
+                <m:rPr>
+                  <m:sty m:val="p"/>
+                </m:rPr>
+                <m:t>/</m:t>
+              </m:r>
+              <m:rad>
+                <m:radPr>
+                  <m:degHide m:val="on"/>
+                </m:radPr>
+                <m:deg/>
+                <m:e>
+                  <m:r>
+                    <m:t>N</m:t>
+                  </m:r>
+                </m:e>
+              </m:rad>
+            </m:oMath>
+            <w:r>
+              <w:t xml:space="preserve"> </w:t>
+            </w:r>
+            <w:r>
+              <w:t xml:space="preserve">convergence</w:t>
+            </w:r>
+          </w:p>
+        </w:tc>
+        <w:tc>
+          <w:tcPr/>
+          <w:p>
+            <w:pPr>
+              <w:pStyle w:val="Compact"/>
+              <w:jc w:val="left"/>
+            </w:pPr>
+            <w:r>
+              <w:rPr>
+                <w:rStyle w:val="VerbatimChar"/>
+              </w:rPr>
+              <w:t xml:space="preserve">validation/test_a1_tracedistance.py</w:t>
+            </w:r>
+          </w:p>
+        </w:tc>
+      </w:tr>
+      <w:tr>
+        <w:tc>
+          <w:tcPr/>
+          <w:p>
+            <w:pPr>
+              <w:pStyle w:val="Compact"/>
+              <w:jc w:val="left"/>
+            </w:pPr>
+            <w:r>
+              <w:t xml:space="preserve">Fig. 3</w:t>
+            </w:r>
+          </w:p>
+        </w:tc>
+        <w:tc>
+          <w:tcPr/>
+          <w:p>
+            <w:pPr>
+              <w:pStyle w:val="Compact"/>
+              <w:jc w:val="left"/>
+            </w:pPr>
+            <w:r>
+              <w:t xml:space="preserve">Regime map: variance ratio vs. noise strength</w:t>
+            </w:r>
+          </w:p>
+        </w:tc>
+        <w:tc>
+          <w:tcPr/>
+          <w:p>
+            <w:pPr>
+              <w:pStyle w:val="Compact"/>
+              <w:jc w:val="left"/>
+            </w:pPr>
+            <w:r>
+              <w:rPr>
+                <w:rStyle w:val="VerbatimChar"/>
+              </w:rPr>
+              <w:t xml:space="preserve">validation/test_a3_sweep.py</w:t>
+            </w:r>
+          </w:p>
+        </w:tc>
+      </w:tr>
+      <w:tr>
+        <w:tc>
+          <w:tcPr/>
+          <w:p>
+            <w:pPr>
+              <w:pStyle w:val="Compact"/>
+              <w:jc w:val="left"/>
+            </w:pPr>
+            <w:r>
+              <w:t xml:space="preserve">Fig. 4</w:t>
+            </w:r>
+          </w:p>
+        </w:tc>
+        <w:tc>
+          <w:tcPr/>
+          <w:p>
+            <w:pPr>
+              <w:pStyle w:val="Compact"/>
+              <w:jc w:val="left"/>
+            </w:pPr>
+            <w:r>
+              <w:t xml:space="preserve">Scaling of the trajectory-reduction factor vs. n</w:t>
+            </w:r>
+          </w:p>
+        </w:tc>
+        <w:tc>
+          <w:tcPr/>
+          <w:p>
+            <w:pPr>
+              <w:pStyle w:val="Compact"/>
+              <w:jc w:val="left"/>
+            </w:pPr>
+            <w:r>
+              <w:rPr>
+                <w:rStyle w:val="VerbatimChar"/>
+              </w:rPr>
+              <w:t xml:space="preserve">validation/test_a3_sweep.py</w:t>
+            </w:r>
+          </w:p>
+        </w:tc>
+      </w:tr>
+      <w:tr>
+        <w:tc>
+          <w:tcPr/>
+          <w:p>
+            <w:pPr>
+              <w:pStyle w:val="Compact"/>
+              <w:jc w:val="left"/>
+            </w:pPr>
+            <w:r>
+              <w:t xml:space="preserve">Fig. 5</w:t>
+            </w:r>
+          </w:p>
+        </w:tc>
+        <w:tc>
+          <w:tcPr/>
+          <w:p>
+            <w:pPr>
+              <w:pStyle w:val="Compact"/>
+              <w:jc w:val="left"/>
+            </w:pPr>
+            <w:r>
+              <w:t xml:space="preserve">Applicability map: coherent erosion of the advantage</w:t>
+            </w:r>
+          </w:p>
+        </w:tc>
+        <w:tc>
+          <w:tcPr/>
+          <w:p>
+            <w:pPr>
+              <w:pStyle w:val="Compact"/>
+              <w:jc w:val="left"/>
+            </w:pPr>
+            <w:r>
+              <w:rPr>
+                <w:rStyle w:val="VerbatimChar"/>
+              </w:rPr>
+              <w:t xml:space="preserve">validation/test_c_caveats.py</w:t>
+            </w:r>
+          </w:p>
+        </w:tc>
+      </w:tr>
+      <w:tr>
+        <w:tc>
+          <w:tcPr/>
+          <w:p>
+            <w:pPr>
+              <w:pStyle w:val="Compact"/>
+              <w:jc w:val="left"/>
+            </w:pPr>
+            <w:r>
+              <w:t xml:space="preserve">Fig. 6</w:t>
+            </w:r>
+          </w:p>
+        </w:tc>
+        <w:tc>
+          <w:tcPr/>
+          <w:p>
+            <w:pPr>
+              <w:pStyle w:val="Compact"/>
+              <w:jc w:val="left"/>
+            </w:pPr>
+            <w:r>
+              <w:t xml:space="preserve">Head-to-head vs. Qiskit-Aer</w:t>
+            </w:r>
+          </w:p>
+        </w:tc>
+        <w:tc>
+          <w:tcPr/>
+          <w:p>
+            <w:pPr>
+              <w:pStyle w:val="Compact"/>
+              <w:jc w:val="left"/>
+            </w:pPr>
+            <w:r>
+              <w:rPr>
+                <w:rStyle w:val="VerbatimChar"/>
+              </w:rPr>
+              <w:t xml:space="preserve">validation/test_a4_vs_aer.py</w:t>
+            </w:r>
+          </w:p>
+        </w:tc>
+      </w:tr>
+      <w:tr>
+        <w:tc>
+          <w:tcPr/>
+          <w:p>
+            <w:pPr>
+              <w:pStyle w:val="Compact"/>
+              <w:jc w:val="left"/>
+            </w:pPr>
+            <w:r>
+              <w:t xml:space="preserve">Table I</w:t>
+            </w:r>
+          </w:p>
+        </w:tc>
+        <w:tc>
+          <w:tcPr/>
+          <w:p>
+            <w:pPr>
+              <w:pStyle w:val="Compact"/>
+              <w:jc w:val="left"/>
+            </w:pPr>
+            <w:r>
+              <w:t xml:space="preserve">Differentiation from the closest related work</w:t>
+            </w:r>
+          </w:p>
+        </w:tc>
+        <w:tc>
+          <w:tcPr/>
+          <w:p>
+            <w:pPr>
+              <w:pStyle w:val="Compact"/>
+              <w:jc w:val="left"/>
+            </w:pPr>
+            <w:r>
+              <w:t xml:space="preserve">(narrative)</w:t>
+            </w:r>
+          </w:p>
+        </w:tc>
+      </w:tr>
+      <w:tr>
+        <w:tc>
+          <w:tcPr/>
+          <w:p>
+            <w:pPr>
+              <w:pStyle w:val="Compact"/>
+              <w:jc w:val="left"/>
+            </w:pPr>
+            <w:r>
+              <w:t xml:space="preserve">Table II</w:t>
+            </w:r>
+          </w:p>
+        </w:tc>
+        <w:tc>
+          <w:tcPr/>
+          <w:p>
+            <w:pPr>
+              <w:pStyle w:val="Compact"/>
+              <w:jc w:val="left"/>
+            </w:pPr>
+            <w:r>
+              <w:t xml:space="preserve">Regime map, numeric</w:t>
+            </w:r>
+          </w:p>
+        </w:tc>
+        <w:tc>
+          <w:tcPr/>
+          <w:p>
+            <w:pPr>
+              <w:pStyle w:val="Compact"/>
+              <w:jc w:val="left"/>
+            </w:pPr>
+            <w:r>
+              <w:rPr>
+                <w:rStyle w:val="VerbatimChar"/>
+              </w:rPr>
+              <w:t xml:space="preserve">validation/test_a3_sweep.py</w:t>
+            </w:r>
+          </w:p>
+        </w:tc>
+      </w:tr>
+      <w:tr>
+        <w:tc>
+          <w:tcPr/>
+          <w:p>
+            <w:pPr>
+              <w:pStyle w:val="Compact"/>
+              <w:jc w:val="left"/>
+            </w:pPr>
+            <w:r>
+              <w:t xml:space="preserve">Table III</w:t>
+            </w:r>
+          </w:p>
+        </w:tc>
+        <w:tc>
+          <w:tcPr/>
+          <w:p>
+            <w:pPr>
+              <w:pStyle w:val="Compact"/>
+              <w:jc w:val="left"/>
+            </w:pPr>
+            <w:r>
+              <w:t xml:space="preserve">Trajectories-to-target vs. n</w:t>
+            </w:r>
+          </w:p>
+        </w:tc>
+        <w:tc>
+          <w:tcPr/>
+          <w:p>
+            <w:pPr>
+              <w:pStyle w:val="Compact"/>
+              <w:jc w:val="left"/>
+            </w:pPr>
+            <w:r>
+              <w:rPr>
+                <w:rStyle w:val="VerbatimChar"/>
+              </w:rPr>
+              <w:t xml:space="preserve">validation/test_a3_sweep.py</w:t>
+            </w:r>
+          </w:p>
+        </w:tc>
+      </w:tr>
+      <w:tr>
+        <w:tc>
+          <w:tcPr/>
+          <w:p>
+            <w:pPr>
+              <w:pStyle w:val="Compact"/>
+              <w:jc w:val="left"/>
+            </w:pPr>
+            <w:r>
+              <w:t xml:space="preserve">Table IV</w:t>
+            </w:r>
+          </w:p>
+        </w:tc>
+        <w:tc>
+          <w:tcPr/>
+          <w:p>
+            <w:pPr>
+              <w:pStyle w:val="Compact"/>
+              <w:jc w:val="left"/>
+            </w:pPr>
+            <w:r>
+              <w:t xml:space="preserve">Head-to-head at n = 10</w:t>
+            </w:r>
+          </w:p>
+        </w:tc>
+        <w:tc>
+          <w:tcPr/>
+          <w:p>
+            <w:pPr>
+              <w:pStyle w:val="Compact"/>
+              <w:jc w:val="left"/>
+            </w:pPr>
+            <w:r>
+              <w:rPr>
+                <w:rStyle w:val="VerbatimChar"/>
+              </w:rPr>
+              <w:t xml:space="preserve">validation/test_a4_vs_aer.py</w:t>
+            </w:r>
+          </w:p>
+        </w:tc>
+      </w:tr>
+    </w:tbl>
+    <w:p>
+      <w:pPr>
+        <w:pStyle w:val="BodyText"/>
+      </w:pPr>
+      <w:r>
+        <w:t xml:space="preserve">All figures are regenerated from the archived CSVs by</w:t>
+      </w:r>
+      <w:r>
+        <w:t xml:space="preserve"> </w:t>
+      </w:r>
+      <w:r>
+        <w:rPr>
+          <w:rStyle w:val="VerbatimChar"/>
+        </w:rPr>
+        <w:t xml:space="preserve">paper/figures/make_figures.py</w:t>
+      </w:r>
+      <w:r>
+        <w:t xml:space="preserve">; no figure</w:t>
+      </w:r>
+      <w:r>
+        <w:t xml:space="preserve"> </w:t>
+      </w:r>
+      <w:r>
+        <w:t xml:space="preserve">contains data that is not present in</w:t>
+      </w:r>
+      <w:r>
+        <w:t xml:space="preserve"> </w:t>
+      </w:r>
+      <w:r>
+        <w:rPr>
+          <w:rStyle w:val="VerbatimChar"/>
+        </w:rPr>
+        <w:t xml:space="preserve">bench/results/</w:t>
+      </w:r>
+      <w:r>
+        <w:t xml:space="preserve">.</w:t>
+      </w:r>
+    </w:p>
+    <w:p>
+      <w:r>
+        <w:pict>
+          <v:rect style="width:0;height:1.5pt" o:hralign="center" o:hrstd="t" o:hr="t"/>
+        </w:pict>
+      </w:r>
+    </w:p>
+    <w:bookmarkEnd w:id="14"/>
+    <w:bookmarkStart w:id="15" w:name="s4.-raw-data-dictionary"/>
+    <w:p>
+      <w:pPr>
+        <w:pStyle w:val="Heading2"/>
+      </w:pPr>
+      <w:r>
+        <w:t xml:space="preserve">S4. Raw data dictionary</w:t>
+      </w:r>
+    </w:p>
+    <w:p>
+      <w:pPr>
+        <w:pStyle w:val="FirstParagraph"/>
+      </w:pPr>
+      <w:r>
+        <w:t xml:space="preserve">All raw outputs are archived as CSV under</w:t>
+      </w:r>
+      <w:r>
+        <w:t xml:space="preserve"> </w:t>
+      </w:r>
+      <w:r>
+        <w:rPr>
+          <w:rStyle w:val="VerbatimChar"/>
+        </w:rPr>
+        <w:t xml:space="preserve">bench/results/</w:t>
+      </w:r>
+      <w:r>
+        <w:t xml:space="preserve">, each with a comment header recording the</w:t>
+      </w:r>
+      <w:r>
+        <w:t xml:space="preserve"> </w:t>
+      </w:r>
+      <w:r>
+        <w:t xml:space="preserve">environment, circuit, noise strength, and seed.</w:t>
+      </w:r>
+    </w:p>
+    <w:tbl>
+      <w:tblPr>
+        <w:tblStyle w:val="Table"/>
+        <w:tblW w:type="pct" w:w="5000"/>
+        <w:tblLayout w:type="fixed"/>
+        <w:tblLook w:firstRow="1" w:lastRow="0" w:firstColumn="0" w:lastColumn="0" w:noHBand="0" w:noVBand="0" w:val="0020"/>
+      </w:tblPr>
+      <w:tblGrid>
+        <w:gridCol w:w="2640"/>
+        <w:gridCol w:w="2640"/>
+        <w:gridCol w:w="2640"/>
+      </w:tblGrid>
+      <w:tr>
+        <w:trPr>
+          <w:tblHeader w:val="on"/>
+        </w:trPr>
+        <w:tc>
+          <w:tcPr/>
+          <w:p>
+            <w:pPr>
+              <w:pStyle w:val="Compact"/>
+              <w:jc w:val="left"/>
+            </w:pPr>
+            <w:r>
               <w:t xml:space="preserve">File</w:t>
             </w:r>
           </w:p>
@@ -1449,17 +2055,41 @@
               <w:jc w:val="left"/>
             </w:pPr>
             <w:r>
-              <w:t xml:space="preserve">trace distance vs. N;</w:t>
+              <w:t xml:space="preserve">trace distance vs. </w:t>
+            </w:r>
+            <m:oMath>
+              <m:r>
+                <m:t>N</m:t>
+              </m:r>
+            </m:oMath>
+            <w:r>
+              <w:t xml:space="preserve">;</w:t>
             </w:r>
             <w:r>
               <w:t xml:space="preserve"> </w:t>
             </w:r>
-            <w:r>
-              <w:rPr>
-                <w:rStyle w:val="VerbatimChar"/>
-              </w:rPr>
-              <w:t xml:space="preserve">D·√N</w:t>
-            </w:r>
+            <m:oMath>
+              <m:r>
+                <m:t>D</m:t>
+              </m:r>
+              <m:r>
+                <m:rPr>
+                  <m:sty m:val="p"/>
+                </m:rPr>
+                <m:t>⋅</m:t>
+              </m:r>
+              <m:rad>
+                <m:radPr>
+                  <m:degHide m:val="on"/>
+                </m:radPr>
+                <m:deg/>
+                <m:e>
+                  <m:r>
+                    <m:t>N</m:t>
+                  </m:r>
+                </m:e>
+              </m:rad>
+            </m:oMath>
           </w:p>
         </w:tc>
         <w:tc>
@@ -1499,7 +2129,24 @@
               <w:jc w:val="left"/>
             </w:pPr>
             <w:r>
-              <w:t xml:space="preserve">empirical vs. closed-form variance (3 unravelings, γt sweep); GPU N-to-target</w:t>
+              <w:t xml:space="preserve">empirical vs. closed-form variance (3 unravelings,</w:t>
+            </w:r>
+            <w:r>
+              <w:t xml:space="preserve"> </w:t>
+            </w:r>
+            <m:oMath>
+              <m:r>
+                <m:t>γ</m:t>
+              </m:r>
+              <m:r>
+                <m:t>t</m:t>
+              </m:r>
+            </m:oMath>
+            <w:r>
+              <w:t xml:space="preserve"> </w:t>
+            </w:r>
+            <w:r>
+              <w:t xml:space="preserve">sweep); GPU N-to-target</w:t>
             </w:r>
           </w:p>
         </w:tc>
@@ -1552,7 +2199,7 @@
               <w:jc w:val="left"/>
             </w:pPr>
             <w:r>
-              <w:t xml:space="preserve">Fig. 3, Fig. 4, Tables I–II</w:t>
+              <w:t xml:space="preserve">Fig. 3, Fig. 4, Tables II–III</w:t>
             </w:r>
           </w:p>
         </w:tc>
@@ -1593,7 +2240,7 @@
               <w:jc w:val="left"/>
             </w:pPr>
             <w:r>
-              <w:t xml:space="preserve">Fig. 6, Table III</w:t>
+              <w:t xml:space="preserve">Fig. 6, Table IV</w:t>
             </w:r>
           </w:p>
         </w:tc>
@@ -1622,8 +2269,13 @@
               <w:jc w:val="left"/>
             </w:pPr>
             <w:r>
-              <w:t xml:space="preserve">GHZ stabilizer speedups; erosion vs. θ</w:t>
-            </w:r>
+              <w:t xml:space="preserve">GHZ stabilizer speedups; erosion vs. </w:t>
+            </w:r>
+            <m:oMath>
+              <m:r>
+                <m:t>θ</m:t>
+              </m:r>
+            </m:oMath>
           </w:p>
         </w:tc>
         <w:tc>
@@ -1647,23 +2299,23 @@
         </w:pict>
       </w:r>
     </w:p>
-    <w:bookmarkEnd w:id="14"/>
-    <w:bookmarkStart w:id="18" w:name="s4.-derivations"/>
+    <w:bookmarkEnd w:id="15"/>
+    <w:bookmarkStart w:id="19" w:name="s5.-derivations"/>
     <w:p>
       <w:pPr>
         <w:pStyle w:val="Heading2"/>
       </w:pPr>
       <w:r>
-        <w:t xml:space="preserve">S4. Derivations</w:t>
+        <w:t xml:space="preserve">S5. Derivations</w:t>
       </w:r>
     </w:p>
-    <w:bookmarkStart w:id="15" w:name="X4be79cf5c0875c581b9edfe602cf94bb88385d8"/>
+    <w:bookmarkStart w:id="16" w:name="X44382bd82a557334450bbae4d06da01db72be39"/>
     <w:p>
       <w:pPr>
         <w:pStyle w:val="Heading3"/>
       </w:pPr>
       <w:r>
-        <w:t xml:space="preserve">S4.1 Projector unraveling reproduces the dephasing generator</w:t>
+        <w:t xml:space="preserve">S5.1 Projector unraveling reproduces the dephasing generator</w:t>
       </w:r>
     </w:p>
     <w:p>
@@ -2519,14 +3171,14 @@
         <w:t xml:space="preserve">distinguishable but physically equivalent.</w:t>
       </w:r>
     </w:p>
-    <w:bookmarkEnd w:id="15"/>
-    <w:bookmarkStart w:id="16" w:name="s4.2-estimator-variances"/>
+    <w:bookmarkEnd w:id="16"/>
+    <w:bookmarkStart w:id="17" w:name="s5.2-estimator-variances"/>
     <w:p>
       <w:pPr>
         <w:pStyle w:val="Heading3"/>
       </w:pPr>
       <w:r>
-        <w:t xml:space="preserve">S4.2 Estimator variances</w:t>
+        <w:t xml:space="preserve">S5.2 Estimator variances</w:t>
       </w:r>
     </w:p>
     <w:p>
@@ -3836,14 +4488,14 @@
         <w:t xml:space="preserve">.</w:t>
       </w:r>
     </w:p>
-    <w:bookmarkEnd w:id="16"/>
-    <w:bookmarkStart w:id="17" w:name="s4.3-ghz-stabilizer-observable"/>
+    <w:bookmarkEnd w:id="17"/>
+    <w:bookmarkStart w:id="18" w:name="s5.3-ghz-stabilizer-observable"/>
     <w:p>
       <w:pPr>
         <w:pStyle w:val="Heading3"/>
       </w:pPr>
       <w:r>
-        <w:t xml:space="preserve">S4.3 GHZ stabilizer observable</w:t>
+        <w:t xml:space="preserve">S5.3 GHZ stabilizer observable</w:t>
       </w:r>
     </w:p>
     <w:p>
@@ -4391,15 +5043,15 @@
         </w:pict>
       </w:r>
     </w:p>
-    <w:bookmarkEnd w:id="17"/>
     <w:bookmarkEnd w:id="18"/>
-    <w:bookmarkStart w:id="19" w:name="X16771239141424c65289c1610a54575079a87a9"/>
+    <w:bookmarkEnd w:id="19"/>
+    <w:bookmarkStart w:id="20" w:name="Xd9233c2b0faf0ebd7be47b22516f8f2db1671d0"/>
     <w:p>
       <w:pPr>
         <w:pStyle w:val="Heading2"/>
       </w:pPr>
       <w:r>
-        <w:t xml:space="preserve">S5. Supporting evidence for the Qiskit-Aer canonicalization finding</w:t>
+        <w:t xml:space="preserve">S6. Supporting evidence for the Qiskit-Aer canonicalization finding</w:t>
       </w:r>
     </w:p>
     <w:p>
@@ -4762,7 +5414,41 @@
         <w:t xml:space="preserve"> </w:t>
       </w:r>
       <w:r>
-        <w:t xml:space="preserve">N-to-target ≈ 1001 on CPU and ≈ 1011 in a per-trajectory expectation loop. Inspection</w:t>
+        <w:t xml:space="preserve">N-to-target</w:t>
+      </w:r>
+      <w:r>
+        <w:t xml:space="preserve"> </w:t>
+      </w:r>
+      <m:oMath>
+        <m:r>
+          <m:rPr>
+            <m:sty m:val="p"/>
+          </m:rPr>
+          <m:t>≈</m:t>
+        </m:r>
+      </m:oMath>
+      <w:r>
+        <w:t xml:space="preserve"> </w:t>
+      </w:r>
+      <w:r>
+        <w:t xml:space="preserve">1001 on CPU and</w:t>
+      </w:r>
+      <w:r>
+        <w:t xml:space="preserve"> </w:t>
+      </w:r>
+      <m:oMath>
+        <m:r>
+          <m:rPr>
+            <m:sty m:val="p"/>
+          </m:rPr>
+          <m:t>≈</m:t>
+        </m:r>
+      </m:oMath>
+      <w:r>
+        <w:t xml:space="preserve"> </w:t>
+      </w:r>
+      <w:r>
+        <w:t xml:space="preserve">1011 in a per-trajectory expectation loop. Inspection</w:t>
       </w:r>
       <w:r>
         <w:t xml:space="preserve"> </w:t>
@@ -5003,14 +5689,14 @@
         </w:pict>
       </w:r>
     </w:p>
-    <w:bookmarkEnd w:id="19"/>
-    <w:bookmarkStart w:id="20" w:name="s6.-known-limitations-of-the-artifact"/>
+    <w:bookmarkEnd w:id="20"/>
+    <w:bookmarkStart w:id="21" w:name="s7.-known-limitations-of-the-artifact"/>
     <w:p>
       <w:pPr>
         <w:pStyle w:val="Heading2"/>
       </w:pPr>
       <w:r>
-        <w:t xml:space="preserve">S6. Known limitations of the artifact</w:t>
+        <w:t xml:space="preserve">S7. Known limitations of the artifact</w:t>
       </w:r>
     </w:p>
     <w:p>
@@ -5125,8 +5811,8 @@
         <w:t xml:space="preserve">sampled exactly. Non-Pauli channels require norm-dependent sampling and are not exercised here.</w:t>
       </w:r>
     </w:p>
-    <w:bookmarkEnd w:id="20"/>
     <w:bookmarkEnd w:id="21"/>
+    <w:bookmarkEnd w:id="22"/>
     <w:sectPr>
       <w:footnotePr>
         <w:numRestart w:val="eachSect"/>

</xml_diff>